<commit_message>
Emílio Santiago: revisão parte 3
Co-Authored-By: Claude Opus 5.5 <noreply@anthropic.com>
Claude-Session: https://claude.ai/code/session_01MJjUEEZrxQDEUifKK2vj9g
</commit_message>
<xml_diff>
--- a/roteiros/emilio-santiago/EmilioSantiago_Parte3.docx
+++ b/roteiros/emilio-santiago/EmilioSantiago_Parte3.docx
@@ -31,7 +31,7 @@
         <w:rPr>
           <w:color w:val="000000"/>
         </w:rPr>
-        <w:t>Naquele dia, a coluna do jornalista Léo Dias, no jornal O Dia, publicou uma nota que pegou o meio musical de surpresa.</w:t>
+        <w:t>Naquele dia, a coluna do jornalista Léo Dias, no jornal O Dia, publicou uma nota curta.</w:t>
       </w:r>
     </w:p>
     <w:p>
@@ -55,7 +55,7 @@
         <w:rPr>
           <w:color w:val="000000"/>
         </w:rPr>
-        <w:t>A imprensa tratou o caso com cuidado, quase na ponta dos pés. As manchetes falavam em "suposto namorado".</w:t>
+        <w:t>As manchetes falavam em "suposto namorado".</w:t>
       </w:r>
     </w:p>
     <w:p>
@@ -87,7 +87,7 @@
         <w:rPr>
           <w:color w:val="000000"/>
         </w:rPr>
-        <w:t>Durante quarenta anos, Emílio tinha protegido a própria intimidade. Tinha dito que preferia não levantar bandeiras. E, sem nenhum papel assinado, a pessoa que dividia a vida com ele precisava agora provar, diante de um juiz, que tinha existido.</w:t>
+        <w:t>Durante toda a carreira, Emílio tinha protegido a própria intimidade. Tinha dito que preferia não levantar bandeiras. E, sem nenhum papel assinado, a pessoa que dividia a vida com ele precisava agora provar, diante de um juiz, que tinha existido.</w:t>
       </w:r>
     </w:p>
     <w:p>
@@ -111,7 +111,7 @@
         <w:rPr>
           <w:color w:val="000000"/>
         </w:rPr>
-        <w:t>Uma reportagem mostrou, pela primeira vez, o tamanho da confusão.</w:t>
+        <w:t>Uma reportagem mostrou o tamanho da confusão.</w:t>
       </w:r>
     </w:p>
     <w:p>
@@ -183,7 +183,7 @@
         <w:rPr>
           <w:color w:val="C00000"/>
         </w:rPr>
-        <w:t>Lembra do velório na Câmara de Vereadores, com o público cantando "Saigon"? Pois é. Naquele mesmo dia, longe das câmeras, aconteceu uma cena que quase ninguém viu. E dois dias depois, o homem que protagonizou aquela cena estava numa UTI, intubado, com o mesmo problema que tinha matado Emílio.</w:t>
+        <w:t>Lembra do velório na Câmara de Vereadores, com o público cantando "Saigon"? Naquele mesmo dia aconteceu uma cena que quase ninguém viu. E dois dias depois, o homem que protagonizou aquela cena estava numa UTI, intubado, com o mesmo problema que tinha matado Emílio.</w:t>
       </w:r>
     </w:p>
     <w:p>
@@ -231,7 +231,7 @@
         <w:rPr>
           <w:color w:val="000000"/>
         </w:rPr>
-        <w:t>As pessoas próximas de Emílio reagiram rápido à história dele. A assessora de imprensa do cantor, Eulália Figueira, disse que aquela versão não procedia.</w:t>
+        <w:t>As pessoas próximas de Emílio negaram a história. A assessora de imprensa do cantor, Eulália Figueira, disse que aquela versão não procedia.</w:t>
       </w:r>
     </w:p>
     <w:p>
@@ -247,7 +247,7 @@
         <w:rPr>
           <w:color w:val="000000"/>
         </w:rPr>
-        <w:t>No dia vinte e dois de março, um dia depois do enterro, Aleksander foi internado às pressas no Rio de Janeiro. Suspeita de AVC.</w:t>
+        <w:t>No dia vinte e dois de março, um dia depois do enterro, Aleksander foi internado no Rio de Janeiro. Suspeita de AVC.</w:t>
       </w:r>
     </w:p>
     <w:p>
@@ -455,7 +455,7 @@
         <w:rPr>
           <w:color w:val="1F4EB4"/>
         </w:rPr>
-        <w:t>Mas aquela decisão, em vez de encerrar a briga, acendeu a parte mais sombria dela.</w:t>
+        <w:t>Mas aquela decisão estava longe de encerrar a guerra. A parte mais sombria ainda estava por vir.</w:t>
       </w:r>
     </w:p>
     <w:p>
@@ -463,7 +463,7 @@
         <w:rPr>
           <w:color w:val="1F4EB4"/>
         </w:rPr>
-        <w:t>Porque o homem que dizia ser filho de Emílio não aceitou perder. Aleksander Nunes insistia que tinha o sangue do cantor. Os exames que ele conseguiu fazer davam resultados inconclusivos.</w:t>
+        <w:t>O homem que dizia ser filho de Emílio continuava lutando na Justiça. Aleksander Nunes insistia que tinha o sangue do cantor. Os exames que ele conseguiu fazer davam resultados inconclusivos.</w:t>
       </w:r>
     </w:p>
     <w:p>

</xml_diff>